<commit_message>
Add comprehensive analysis pipeline and validation tools for AD Model v3
This update includes:
- Updated manuscript files (Word, Markdown, LaTeX) with latest revisions
- New full analysis pipeline (run_full_analysis.py) for complete model execution
- Figure generation scripts for manuscript Figures 2, 3, and 4
- Age distribution and prevalence validation tools
- ONS projection data integration
- Reorganized PSA results from root to AD_Model_v3 folder
- Cleanup utilities for duplicate PSA files
- Test pipeline for model validation
- Generated validation plots and data exports
- Documentation updates (README, data export guide, LaTeX update summary)

🤖 Generated with [Claude Code](https://claude.com/claude-code)

Co-Authored-By: Claude <noreply@anthropic.com>
</commit_message>
<xml_diff>
--- a/AD_Study/v3/AD_FullText_v3.docx
+++ b/AD_Study/v3/AD_FullText_v3.docx
@@ -24,31 +24,54 @@
     <w:p>
       <w:pPr>
         <w:rPr>
+          <w:sz w:val="28"/>
+          <w:szCs w:val="28"/>
+        </w:rPr>
+      </w:pPr>
+      <w:r>
+        <w:rPr>
+          <w:sz w:val="28"/>
+          <w:szCs w:val="28"/>
+        </w:rPr>
+        <w:t>Edward Coote, Dr Nitesh Patel, Dr Rajesh Vijayanarayanan</w:t>
+      </w:r>
+    </w:p>
+    <w:p>
+      <w:pPr>
+        <w:rPr>
+          <w:sz w:val="28"/>
+          <w:szCs w:val="28"/>
+        </w:rPr>
+      </w:pPr>
+    </w:p>
+    <w:p>
+      <w:pPr>
+        <w:rPr>
           <w:b/>
           <w:bCs/>
           <w:sz w:val="28"/>
           <w:szCs w:val="28"/>
         </w:rPr>
       </w:pPr>
-    </w:p>
-    <w:p>
-      <w:pPr>
+      <w:r>
         <w:rPr>
           <w:b/>
           <w:bCs/>
           <w:sz w:val="28"/>
           <w:szCs w:val="28"/>
         </w:rPr>
-      </w:pPr>
-      <w:r>
+        <w:t>Author information</w:t>
+      </w:r>
+    </w:p>
+    <w:p>
+      <w:pPr>
         <w:rPr>
           <w:b/>
           <w:bCs/>
           <w:sz w:val="28"/>
           <w:szCs w:val="28"/>
         </w:rPr>
-        <w:t xml:space="preserve">Edward Coote, </w:t>
-      </w:r>
+      </w:pPr>
       <w:r>
         <w:rPr>
           <w:b/>
@@ -56,17 +79,18 @@
           <w:sz w:val="28"/>
           <w:szCs w:val="28"/>
         </w:rPr>
-        <w:t xml:space="preserve">Dr Nitesh Patel, </w:t>
-      </w:r>
-      <w:r>
+        <w:t>Keywords</w:t>
+      </w:r>
+    </w:p>
+    <w:p>
+      <w:pPr>
         <w:rPr>
           <w:b/>
           <w:bCs/>
           <w:sz w:val="28"/>
           <w:szCs w:val="28"/>
         </w:rPr>
-        <w:t xml:space="preserve">Dr Rajesh </w:t>
-      </w:r>
+      </w:pPr>
       <w:r>
         <w:rPr>
           <w:b/>
@@ -74,10 +98,9 @@
           <w:sz w:val="28"/>
           <w:szCs w:val="28"/>
         </w:rPr>
-        <w:t>Vijayanarayanan</w:t>
-      </w:r>
-    </w:p>
-    <w:p/>
+        <w:t>Statements &amp; Declarations</w:t>
+      </w:r>
+    </w:p>
     <w:p>
       <w:pPr>
         <w:rPr>
@@ -94,276 +117,9 @@
           <w:sz w:val="28"/>
           <w:szCs w:val="28"/>
         </w:rPr>
-        <w:t>Abstract</w:t>
-      </w:r>
-    </w:p>
-    <w:p>
-      <w:pPr>
-        <w:rPr>
-          <w:b/>
-          <w:bCs/>
-        </w:rPr>
-      </w:pPr>
-      <w:r>
-        <w:rPr>
-          <w:b/>
-          <w:bCs/>
-        </w:rPr>
-        <w:t>Background</w:t>
-      </w:r>
-    </w:p>
-    <w:p>
-      <w:r>
-        <w:t xml:space="preserve">Periodontal disease (PD) is a </w:t>
-      </w:r>
-      <w:r>
-        <w:t xml:space="preserve">prevalent modifiable dementia risk factor that is becoming increasingly established with increased dementia incidence. </w:t>
-      </w:r>
-      <w:r>
-        <w:t xml:space="preserve">At least 50% of over-65 year olds in England are </w:t>
-      </w:r>
-      <w:r>
-        <w:t>affected by irreversible PD</w:t>
-      </w:r>
-      <w:r>
-        <w:t>, an</w:t>
-      </w:r>
-      <w:r>
-        <w:t>d dementia-related costs are projected to rise substantially</w:t>
-      </w:r>
-      <w:r>
-        <w:t xml:space="preserve">. Understanding the potential impact of PD prevalence changes on future dementia burden is key for </w:t>
-      </w:r>
-      <w:r>
-        <w:t xml:space="preserve">healthcare planning and intervention risk factor prevention. </w:t>
-      </w:r>
-    </w:p>
-    <w:p>
-      <w:pPr>
-        <w:rPr>
-          <w:b/>
-          <w:bCs/>
-        </w:rPr>
-      </w:pPr>
-      <w:r>
-        <w:rPr>
-          <w:b/>
-          <w:bCs/>
-        </w:rPr>
-        <w:t>Methods</w:t>
-      </w:r>
-    </w:p>
-    <w:p>
-      <w:r>
-        <w:t xml:space="preserve">We developed </w:t>
-      </w:r>
-      <w:r>
-        <w:t xml:space="preserve">an individual-level microsimulation </w:t>
-      </w:r>
-      <w:r>
-        <w:t xml:space="preserve">model simulating the </w:t>
-      </w:r>
-      <w:r>
-        <w:t xml:space="preserve">England population aged 65 and older from 2024 to 2040 (yearly timesteps). </w:t>
-      </w:r>
-      <w:r>
-        <w:t>We incorporated increasing dementia severity stages</w:t>
-      </w:r>
-      <w:r>
-        <w:t xml:space="preserve">, care setting transitions and six modifiable risk factors alongside APOE </w:t>
-      </w:r>
-      <w:r>
-        <w:t>ε4</w:t>
-      </w:r>
-      <w:r>
-        <w:t xml:space="preserve"> carrier status. </w:t>
-      </w:r>
-      <w:r>
-        <w:t xml:space="preserve">Age-related dementia onset was driven by a parametric </w:t>
-      </w:r>
-      <w:r>
-        <w:t xml:space="preserve">age-scaled hazard. </w:t>
-      </w:r>
-      <w:r>
-        <w:t xml:space="preserve">Individual risk factor hazard ratios </w:t>
-      </w:r>
-      <w:r>
-        <w:t xml:space="preserve">(HR) </w:t>
-      </w:r>
-      <w:r>
-        <w:t xml:space="preserve">were applied multiplicatively. </w:t>
-      </w:r>
-      <w:r>
-        <w:t>We estimated dementia incidence, prevalence, formal and informal care costs, and quality-adjusted life years (QALYs) under three PD prevalence scenarios (25%, 50% baseline, 75%</w:t>
-      </w:r>
-      <w:r>
-        <w:t>). Our sensitivity analysis included probabilistic sensitivity analysis (PSA) and deterministic one-way sensitivity analysis</w:t>
-      </w:r>
-      <w:r>
-        <w:t xml:space="preserve"> on the PD-dementia onset HR. </w:t>
-      </w:r>
-    </w:p>
-    <w:p>
-      <w:pPr>
-        <w:rPr>
-          <w:b/>
-          <w:bCs/>
-        </w:rPr>
-      </w:pPr>
-      <w:r>
-        <w:rPr>
-          <w:b/>
-          <w:bCs/>
-        </w:rPr>
-        <w:t>Results</w:t>
-      </w:r>
-    </w:p>
-    <w:p>
-      <w:r>
-        <w:t>At 50% PD prevalence, cumulative dementia incidence totalled 2.80 million cases over 2024–2040, with prevalence rising from 7.95% to 10.14%. Reducing PD prevalence to 25% prevented approximately 115,000 incident cases (4.1% reduction) and generated cumulative cost savings of £19.7 billion (£10.9bn formal; £8.8bn informal). Each percentage point reduction in PD prevalence was associated with approximately 678 fewer annual dementia onsets and £46 million in annual savings. Population QALYs varied by less than 0.2% across scenarios. Probabilistic sensitivity analysis confirmed robustness across all outcomes (coefficient of variation 5.2%–</w:t>
-      </w:r>
-      <w:r>
-        <w:t>10</w:t>
-      </w:r>
-      <w:r>
-        <w:t>.4%).</w:t>
-      </w:r>
-    </w:p>
-    <w:p>
-      <w:pPr>
-        <w:rPr>
-          <w:b/>
-          <w:bCs/>
-        </w:rPr>
-      </w:pPr>
-      <w:r>
-        <w:rPr>
-          <w:b/>
-          <w:bCs/>
-        </w:rPr>
-        <w:t>Conclusions</w:t>
-      </w:r>
-    </w:p>
-    <w:p>
-      <w:r>
-        <w:lastRenderedPageBreak/>
-        <w:t xml:space="preserve">Reductions in PD prevalence, if the observed association with dementia is causal, could yield substantial reductions in dementia incidence and associated costs in England. PD functions as a weak but highly prevalent risk factor, where population-level benefits derive from the large exposed population rather than strong individual risk. </w:t>
-      </w:r>
-    </w:p>
-    <w:p/>
-    <w:p>
-      <w:pPr>
-        <w:rPr>
-          <w:b/>
-          <w:bCs/>
-        </w:rPr>
-      </w:pPr>
-      <w:r>
-        <w:rPr>
-          <w:b/>
-          <w:bCs/>
-        </w:rPr>
-        <w:t>Introduction</w:t>
-      </w:r>
-    </w:p>
-    <w:p>
-      <w:r>
-        <w:t xml:space="preserve">The burden of periodontal diseases (PD) in England is substantial. NHS Dental estimates that at least 50% of the UK have some level of </w:t>
-      </w:r>
-      <w:r>
-        <w:t>irreversible</w:t>
-      </w:r>
-      <w:r>
-        <w:t xml:space="preserve"> (≥stage 3)</w:t>
-      </w:r>
-      <w:r>
-        <w:t xml:space="preserve"> periodontal disease (PD), although this is likely to be an underestimate [1]. Globally, there was an estimated 50% increase in oral disease cases between 1990 and 2019, which was higher than the 45% population growth over the period [2]. This trend is expected to increase in high-income countries as the ageing population results in individuals living longer with chronic diseases [3]. Estimations using multi-state population models for periodontal pocketing in the UK project an 8.7% increase from 2020 to 2050, with severe pocketing increasing by 56.7% [4]. </w:t>
-      </w:r>
-    </w:p>
-    <w:p>
-      <w:r>
-        <w:t xml:space="preserve">There is substantial evidence that PD is a risk factor for dementia [5,6]. Periodontal infection leads to systemic inflammation, allowing high inflammatory immune responses to cross the blood-brain barrier which activates the microglial cells in the cerebral cortex, which may contribute to the pathogenesis of dementia [7,8]. Dementia patients have shown higher </w:t>
-      </w:r>
-      <w:r>
-        <w:rPr>
-          <w:i/>
-          <w:iCs/>
-        </w:rPr>
-        <w:t>fusobacterium</w:t>
-      </w:r>
-      <w:r>
-        <w:t xml:space="preserve"> loads, as well as </w:t>
-      </w:r>
-      <w:r>
-        <w:rPr>
-          <w:i/>
-          <w:iCs/>
-        </w:rPr>
-        <w:t xml:space="preserve">Campylobacter rectus </w:t>
-      </w:r>
-      <w:r>
-        <w:t xml:space="preserve">and </w:t>
-      </w:r>
-      <w:r>
-        <w:rPr>
-          <w:i/>
-          <w:iCs/>
-        </w:rPr>
-        <w:t>Porphyromonas gingivalis</w:t>
-      </w:r>
-      <w:r>
-        <w:t xml:space="preserve">, both species of bacteria that are biomarkers for severe PD [9]. One review found that PD was associated with a 22% higher risk of incident dementia during a mean follow up of 11 years, with another using </w:t>
-      </w:r>
-      <w:r>
-        <w:t>population</w:t>
-      </w:r>
-      <w:r>
-        <w:t xml:space="preserve"> studies to suggest a relative risk (RR) of 1.18 (1.06-1.31) for incident dementia in relation to PD [6,10]. There is bidirectional causality, as an individual’s ability to maintain their oral health deteriorates with increased dementia symptoms [11]. However, trial emulation studies testing periodontal treatments have shown their ability to reduce dementia-related brain atrophy in the treatment arms (-0.41; 95% CI; -0.70 to -0.12; </w:t>
-      </w:r>
-      <w:r>
-        <w:rPr>
-          <w:i/>
-          <w:iCs/>
-        </w:rPr>
-        <w:t>P</w:t>
-      </w:r>
-      <w:r>
-        <w:t xml:space="preserve">= 0.0051) [12]. A retrospective </w:t>
-      </w:r>
-      <w:r>
-        <w:t>population</w:t>
-      </w:r>
-      <w:r>
-        <w:t xml:space="preserve"> study also identified that periodontal treatment reduced the risk of dementia mortality [13]. Longitudinal </w:t>
-      </w:r>
-      <w:r>
-        <w:t>population</w:t>
-      </w:r>
-      <w:r>
-        <w:t xml:space="preserve"> studies have revealed that PD was significantly associated with increased dementia incidence, even after adjusting for major chronic diseases [14,15,16]. These longitudinal studies were restricted to dementia-free participants at baseline, minimising reverse causality. </w:t>
-      </w:r>
-    </w:p>
-    <w:p>
-      <w:r>
-        <w:t xml:space="preserve">Dementia costs in England are expected to rise significantly, with one estimate forecasting a 173% rise from 2019 to 2040, totalling £80.4 billion by 2040 [17]. The same projection gives 1.35 million total older people living with dementia in England in 2040. Approximately 45% of all dementia cases are attributable to preventable risk factors [18]. Modelling the effects of population-based interventions on dementia risk factors </w:t>
-      </w:r>
-      <w:r>
-        <w:lastRenderedPageBreak/>
-        <w:t>can provide estimates of potential cost-saving and disease reduction. If hypertension prevalence fell in England and Wales by 50% between 2027 and 2060, an estimated 57 fewer deaths per 100,000 population but an increase of 9 more dementia cases per 100,000 is expected [19]. This highlights the interplay between reduced risk factor prevalence and extended life expectancy, which may raise overall dementia prevalence</w:t>
-      </w:r>
-      <w:r>
-        <w:t xml:space="preserve"> despite a risk factor intervention</w:t>
-      </w:r>
-      <w:r>
-        <w:t xml:space="preserve">. A 50% reduction in the current global prevalence of PD could prevent 850,000 individuals from developing dementia [6]. Given the strong evidence linking periodontal disease to dementia and the projected rise in dementia-related costs, estimating the effects of reducing periodontal disease prevalence is essential to inform prevention strategies. </w:t>
-      </w:r>
-    </w:p>
-    <w:p>
-      <w:r>
-        <w:t xml:space="preserve">We use an individual-level microsimulation model to estimate the costs and benefits associated with counterfactual scenarios in severe PD prevalence on future dementia outcomes. We start with the current estimated PD prevalence of 50%, then test a prevalence of 25% and 75%. This will account for the effects of other dementia risk factors on both dementia and mortality risk. </w:t>
-      </w:r>
-    </w:p>
-    <w:p/>
+        <w:t>Funding</w:t>
+      </w:r>
+    </w:p>
     <w:p>
       <w:pPr>
         <w:rPr>
@@ -380,7 +136,7 @@
           <w:sz w:val="28"/>
           <w:szCs w:val="28"/>
         </w:rPr>
-        <w:t>Methods</w:t>
+        <w:t>Competing Interests</w:t>
       </w:r>
     </w:p>
     <w:p>
@@ -388,12 +144,520 @@
         <w:rPr>
           <w:b/>
           <w:bCs/>
+          <w:sz w:val="28"/>
+          <w:szCs w:val="28"/>
         </w:rPr>
       </w:pPr>
       <w:r>
         <w:rPr>
           <w:b/>
           <w:bCs/>
+          <w:sz w:val="28"/>
+          <w:szCs w:val="28"/>
+        </w:rPr>
+        <w:t>Author Contributions</w:t>
+      </w:r>
+    </w:p>
+    <w:p>
+      <w:pPr>
+        <w:rPr>
+          <w:b/>
+          <w:bCs/>
+          <w:sz w:val="28"/>
+          <w:szCs w:val="28"/>
+        </w:rPr>
+      </w:pPr>
+      <w:r>
+        <w:rPr>
+          <w:b/>
+          <w:bCs/>
+          <w:sz w:val="28"/>
+          <w:szCs w:val="28"/>
+        </w:rPr>
+        <w:t xml:space="preserve">Ethics Approval </w:t>
+      </w:r>
+    </w:p>
+    <w:p>
+      <w:pPr>
+        <w:rPr>
+          <w:sz w:val="28"/>
+          <w:szCs w:val="28"/>
+        </w:rPr>
+      </w:pPr>
+      <w:r>
+        <w:rPr>
+          <w:sz w:val="28"/>
+          <w:szCs w:val="28"/>
+        </w:rPr>
+        <w:t>N/a</w:t>
+      </w:r>
+    </w:p>
+    <w:p>
+      <w:pPr>
+        <w:rPr>
+          <w:b/>
+          <w:bCs/>
+          <w:sz w:val="28"/>
+          <w:szCs w:val="28"/>
+        </w:rPr>
+      </w:pPr>
+      <w:r>
+        <w:rPr>
+          <w:b/>
+          <w:bCs/>
+          <w:sz w:val="28"/>
+          <w:szCs w:val="28"/>
+        </w:rPr>
+        <w:t>Consent to Participate</w:t>
+      </w:r>
+    </w:p>
+    <w:p>
+      <w:pPr>
+        <w:rPr>
+          <w:sz w:val="28"/>
+          <w:szCs w:val="28"/>
+        </w:rPr>
+      </w:pPr>
+      <w:r>
+        <w:rPr>
+          <w:sz w:val="28"/>
+          <w:szCs w:val="28"/>
+        </w:rPr>
+        <w:t>N/a</w:t>
+      </w:r>
+    </w:p>
+    <w:p>
+      <w:pPr>
+        <w:rPr>
+          <w:b/>
+          <w:bCs/>
+          <w:sz w:val="28"/>
+          <w:szCs w:val="28"/>
+        </w:rPr>
+      </w:pPr>
+      <w:r>
+        <w:rPr>
+          <w:b/>
+          <w:bCs/>
+          <w:sz w:val="28"/>
+          <w:szCs w:val="28"/>
+        </w:rPr>
+        <w:t xml:space="preserve">Consent to Publish </w:t>
+      </w:r>
+    </w:p>
+    <w:p>
+      <w:pPr>
+        <w:rPr>
+          <w:sz w:val="28"/>
+          <w:szCs w:val="28"/>
+        </w:rPr>
+      </w:pPr>
+      <w:r>
+        <w:rPr>
+          <w:sz w:val="28"/>
+          <w:szCs w:val="28"/>
+        </w:rPr>
+        <w:t>N/a</w:t>
+      </w:r>
+    </w:p>
+    <w:p>
+      <w:pPr>
+        <w:rPr>
+          <w:b/>
+          <w:bCs/>
+          <w:sz w:val="28"/>
+          <w:szCs w:val="28"/>
+        </w:rPr>
+      </w:pPr>
+    </w:p>
+    <w:p>
+      <w:pPr>
+        <w:rPr>
+          <w:b/>
+          <w:bCs/>
+          <w:sz w:val="28"/>
+          <w:szCs w:val="28"/>
+        </w:rPr>
+      </w:pPr>
+    </w:p>
+    <w:p>
+      <w:pPr>
+        <w:rPr>
+          <w:b/>
+          <w:bCs/>
+          <w:sz w:val="28"/>
+          <w:szCs w:val="28"/>
+        </w:rPr>
+      </w:pPr>
+    </w:p>
+    <w:p>
+      <w:pPr>
+        <w:rPr>
+          <w:b/>
+          <w:bCs/>
+          <w:sz w:val="28"/>
+          <w:szCs w:val="28"/>
+        </w:rPr>
+      </w:pPr>
+    </w:p>
+    <w:p>
+      <w:pPr>
+        <w:rPr>
+          <w:b/>
+          <w:bCs/>
+          <w:sz w:val="28"/>
+          <w:szCs w:val="28"/>
+        </w:rPr>
+      </w:pPr>
+    </w:p>
+    <w:p>
+      <w:pPr>
+        <w:rPr>
+          <w:b/>
+          <w:bCs/>
+          <w:sz w:val="28"/>
+          <w:szCs w:val="28"/>
+        </w:rPr>
+      </w:pPr>
+    </w:p>
+    <w:p>
+      <w:pPr>
+        <w:rPr>
+          <w:b/>
+          <w:bCs/>
+          <w:sz w:val="28"/>
+          <w:szCs w:val="28"/>
+        </w:rPr>
+      </w:pPr>
+    </w:p>
+    <w:p>
+      <w:pPr>
+        <w:rPr>
+          <w:b/>
+          <w:bCs/>
+          <w:sz w:val="28"/>
+          <w:szCs w:val="28"/>
+        </w:rPr>
+      </w:pPr>
+    </w:p>
+    <w:p/>
+    <w:p>
+      <w:pPr>
+        <w:rPr>
+          <w:b/>
+          <w:bCs/>
+          <w:sz w:val="28"/>
+          <w:szCs w:val="28"/>
+        </w:rPr>
+      </w:pPr>
+      <w:r>
+        <w:rPr>
+          <w:b/>
+          <w:bCs/>
+          <w:sz w:val="28"/>
+          <w:szCs w:val="28"/>
+        </w:rPr>
+        <w:lastRenderedPageBreak/>
+        <w:t>Abstract</w:t>
+      </w:r>
+    </w:p>
+    <w:p>
+      <w:pPr>
+        <w:rPr>
+          <w:b/>
+          <w:bCs/>
+        </w:rPr>
+      </w:pPr>
+      <w:r>
+        <w:rPr>
+          <w:b/>
+          <w:bCs/>
+        </w:rPr>
+        <w:t>Background</w:t>
+      </w:r>
+    </w:p>
+    <w:p>
+      <w:r>
+        <w:t xml:space="preserve">Periodontal disease (PD) is a </w:t>
+      </w:r>
+      <w:r>
+        <w:t xml:space="preserve">prevalent modifiable dementia risk factor that is becoming increasingly established with increased dementia incidence. </w:t>
+      </w:r>
+      <w:r>
+        <w:t xml:space="preserve">At least 50% of over-65 year olds in England are </w:t>
+      </w:r>
+      <w:r>
+        <w:t>affected by irreversible PD</w:t>
+      </w:r>
+      <w:r>
+        <w:t>, an</w:t>
+      </w:r>
+      <w:r>
+        <w:t>d dementia-related costs are projected to rise substantially</w:t>
+      </w:r>
+      <w:r>
+        <w:t xml:space="preserve">. Understanding the potential impact of PD prevalence changes on future dementia burden is key for </w:t>
+      </w:r>
+      <w:r>
+        <w:t xml:space="preserve">healthcare planning and intervention risk factor prevention. </w:t>
+      </w:r>
+    </w:p>
+    <w:p>
+      <w:pPr>
+        <w:rPr>
+          <w:b/>
+          <w:bCs/>
+        </w:rPr>
+      </w:pPr>
+      <w:r>
+        <w:rPr>
+          <w:b/>
+          <w:bCs/>
+        </w:rPr>
+        <w:t>Methods</w:t>
+      </w:r>
+    </w:p>
+    <w:p>
+      <w:r>
+        <w:t xml:space="preserve">We developed </w:t>
+      </w:r>
+      <w:r>
+        <w:t xml:space="preserve">an individual-level microsimulation </w:t>
+      </w:r>
+      <w:r>
+        <w:t xml:space="preserve">model simulating the </w:t>
+      </w:r>
+      <w:r>
+        <w:t xml:space="preserve">England population aged 65 and older from 2024 to 2040 (yearly timesteps). </w:t>
+      </w:r>
+      <w:r>
+        <w:t>We incorporated increasing dementia severity stages</w:t>
+      </w:r>
+      <w:r>
+        <w:t xml:space="preserve">, care setting transitions and six modifiable risk factors alongside APOE </w:t>
+      </w:r>
+      <w:r>
+        <w:t>ε4</w:t>
+      </w:r>
+      <w:r>
+        <w:t xml:space="preserve"> carrier status. </w:t>
+      </w:r>
+      <w:r>
+        <w:t xml:space="preserve">Age-related dementia onset was driven by a parametric </w:t>
+      </w:r>
+      <w:r>
+        <w:t xml:space="preserve">age-scaled hazard. </w:t>
+      </w:r>
+      <w:r>
+        <w:t xml:space="preserve">Individual risk factor hazard ratios </w:t>
+      </w:r>
+      <w:r>
+        <w:t xml:space="preserve">(HR) </w:t>
+      </w:r>
+      <w:r>
+        <w:t xml:space="preserve">were applied multiplicatively. </w:t>
+      </w:r>
+      <w:r>
+        <w:t>We estimated dementia incidence, prevalence, formal and informal care costs, and quality-adjusted life years (QALYs) under three PD prevalence scenarios (25%, 50% baseline, 75%</w:t>
+      </w:r>
+      <w:r>
+        <w:t>). Our sensitivity analysis included probabilistic sensitivity analysis (PSA) and deterministic one-way sensitivity analysis</w:t>
+      </w:r>
+      <w:r>
+        <w:t xml:space="preserve"> on the PD-dementia onset HR. </w:t>
+      </w:r>
+    </w:p>
+    <w:p>
+      <w:pPr>
+        <w:rPr>
+          <w:b/>
+          <w:bCs/>
+        </w:rPr>
+      </w:pPr>
+      <w:r>
+        <w:rPr>
+          <w:b/>
+          <w:bCs/>
+        </w:rPr>
+        <w:t>Results</w:t>
+      </w:r>
+    </w:p>
+    <w:p>
+      <w:r>
+        <w:t>At 50% PD prevalence, cumulative dementia incidence totalled 2.80 million cases over 2024–2040, with prevalence rising from 7.95% to 10.14%. Reducing PD prevalence to 25% prevented approximately 115,000 incident cases (4.1% reduction) and generated cumulative cost savings of £19.7 billion (£10.9bn formal; £8.8bn informal). Each percentage point reduction in PD prevalence was associated with approximately 678 fewer annual dementia onsets and £46 million in annual savings. Population QALYs varied by less than 0.2% across scenarios. Probabilistic sensitivity analysis confirmed robustness across all outcomes (coefficient of variation 5.2%–</w:t>
+      </w:r>
+      <w:r>
+        <w:t>10</w:t>
+      </w:r>
+      <w:r>
+        <w:t>.4%).</w:t>
+      </w:r>
+    </w:p>
+    <w:p>
+      <w:pPr>
+        <w:rPr>
+          <w:b/>
+          <w:bCs/>
+        </w:rPr>
+      </w:pPr>
+      <w:r>
+        <w:rPr>
+          <w:b/>
+          <w:bCs/>
+        </w:rPr>
+        <w:t>Conclusions</w:t>
+      </w:r>
+    </w:p>
+    <w:p>
+      <w:r>
+        <w:t xml:space="preserve">Reductions in PD prevalence, if the observed association with dementia is causal, could yield substantial reductions in dementia incidence and associated costs in England. PD functions as a weak but highly prevalent risk factor, where population-level benefits derive from the large exposed population rather than strong individual risk. </w:t>
+      </w:r>
+    </w:p>
+    <w:p/>
+    <w:p>
+      <w:pPr>
+        <w:rPr>
+          <w:b/>
+          <w:bCs/>
+        </w:rPr>
+      </w:pPr>
+      <w:r>
+        <w:rPr>
+          <w:b/>
+          <w:bCs/>
+        </w:rPr>
+        <w:t>Introduction</w:t>
+      </w:r>
+    </w:p>
+    <w:p>
+      <w:r>
+        <w:lastRenderedPageBreak/>
+        <w:t xml:space="preserve">The burden of periodontal diseases (PD) in England is substantial. NHS Dental estimates that at least 50% of the UK have some level of </w:t>
+      </w:r>
+      <w:r>
+        <w:t>irreversible</w:t>
+      </w:r>
+      <w:r>
+        <w:t xml:space="preserve"> (≥stage 3)</w:t>
+      </w:r>
+      <w:r>
+        <w:t xml:space="preserve"> periodontal disease (PD), although this is likely to be an underestimate [1]. Globally, there was an estimated 50% increase in oral disease cases between 1990 and 2019, which was higher than the 45% population growth over the period [2]. This trend is expected to increase in high-income countries as the ageing population results in individuals living longer with chronic diseases [3]. Estimations using multi-state population models for periodontal pocketing in the UK project an 8.7% increase from 2020 to 2050, with severe pocketing increasing by 56.7% [4]. </w:t>
+      </w:r>
+    </w:p>
+    <w:p>
+      <w:r>
+        <w:t xml:space="preserve">There is substantial evidence that PD is a risk factor for dementia [5,6]. Periodontal infection leads to systemic inflammation, allowing high inflammatory immune responses to cross the blood-brain barrier which activates the microglial cells in the cerebral cortex, which may contribute to the pathogenesis of dementia [7,8]. Dementia patients have shown higher </w:t>
+      </w:r>
+      <w:r>
+        <w:rPr>
+          <w:i/>
+          <w:iCs/>
+        </w:rPr>
+        <w:t>fusobacterium</w:t>
+      </w:r>
+      <w:r>
+        <w:t xml:space="preserve"> loads, as well as </w:t>
+      </w:r>
+      <w:r>
+        <w:rPr>
+          <w:i/>
+          <w:iCs/>
+        </w:rPr>
+        <w:t xml:space="preserve">Campylobacter rectus </w:t>
+      </w:r>
+      <w:r>
+        <w:t xml:space="preserve">and </w:t>
+      </w:r>
+      <w:r>
+        <w:rPr>
+          <w:i/>
+          <w:iCs/>
+        </w:rPr>
+        <w:t>Porphyromonas gingivalis</w:t>
+      </w:r>
+      <w:r>
+        <w:t xml:space="preserve">, both species of bacteria that are biomarkers for severe PD [9]. One review found that PD was associated with a 22% higher risk of incident dementia during a mean follow up of 11 years, with another using </w:t>
+      </w:r>
+      <w:r>
+        <w:t>population</w:t>
+      </w:r>
+      <w:r>
+        <w:t xml:space="preserve"> studies to suggest a relative risk (RR) of 1.18 (1.06-1.31) for incident dementia in relation to PD [6,10]. There is bidirectional causality, as an individual’s ability to maintain their oral health deteriorates with increased dementia symptoms [11]. However, trial emulation studies testing periodontal treatments have shown their ability to reduce dementia-related brain atrophy in the treatment arms (-0.41; 95% CI; -0.70 to -0.12; </w:t>
+      </w:r>
+      <w:r>
+        <w:rPr>
+          <w:i/>
+          <w:iCs/>
+        </w:rPr>
+        <w:t>P</w:t>
+      </w:r>
+      <w:r>
+        <w:t xml:space="preserve">= 0.0051) [12]. A retrospective </w:t>
+      </w:r>
+      <w:r>
+        <w:t>population</w:t>
+      </w:r>
+      <w:r>
+        <w:t xml:space="preserve"> study also identified that periodontal treatment reduced the risk of dementia mortality [13]. Longitudinal </w:t>
+      </w:r>
+      <w:r>
+        <w:t>population</w:t>
+      </w:r>
+      <w:r>
+        <w:t xml:space="preserve"> studies have revealed that PD was significantly associated with increased dementia incidence, even after adjusting for major chronic diseases [14,15,16]. These longitudinal studies were restricted to dementia-free participants at baseline, minimising reverse causality. </w:t>
+      </w:r>
+    </w:p>
+    <w:p>
+      <w:r>
+        <w:t>Dementia costs in England are expected to rise significantly, with one estimate forecasting a 173% rise from 2019 to 2040, totalling £80.4 billion by 2040 [17]. The same projection gives 1.35 million total older people living with dementia in England in 2040. Approximately 45% of all dementia cases are attributable to preventable risk factors [18]. Modelling the effects of population-based interventions on dementia risk factors can provide estimates of potential cost-saving and disease reduction. If hypertension prevalence fell in England and Wales by 50% between 2027 and 2060, an estimated 57 fewer deaths per 100,000 population but an increase of 9 more dementia cases per 100,000 is expected [19]. This highlights the interplay between reduced risk factor prevalence and extended life expectancy, which may raise overall dementia prevalence</w:t>
+      </w:r>
+      <w:r>
+        <w:t xml:space="preserve"> despite a risk factor intervention</w:t>
+      </w:r>
+      <w:r>
+        <w:t>. A 50% reduction in the current global prevalence of PD could prevent 850,000 individuals from developing dementia [6]. Given the strong evidence linking periodontal disease to dementia and the projected rise in dementia-</w:t>
+      </w:r>
+      <w:r>
+        <w:lastRenderedPageBreak/>
+        <w:t xml:space="preserve">related costs, estimating the effects of reducing periodontal disease prevalence is essential to inform prevention strategies. </w:t>
+      </w:r>
+    </w:p>
+    <w:p>
+      <w:r>
+        <w:t xml:space="preserve">We use an individual-level microsimulation model to estimate the costs and benefits associated with counterfactual scenarios in severe PD prevalence on future dementia outcomes. We start with the current estimated PD prevalence of 50%, then test a prevalence of 25% and 75%. This will account for the effects of other dementia risk factors on both dementia and mortality risk. </w:t>
+      </w:r>
+    </w:p>
+    <w:p/>
+    <w:p>
+      <w:pPr>
+        <w:rPr>
+          <w:b/>
+          <w:bCs/>
+          <w:sz w:val="28"/>
+          <w:szCs w:val="28"/>
+        </w:rPr>
+      </w:pPr>
+      <w:r>
+        <w:rPr>
+          <w:b/>
+          <w:bCs/>
+          <w:sz w:val="28"/>
+          <w:szCs w:val="28"/>
+        </w:rPr>
+        <w:t>Methods</w:t>
+      </w:r>
+    </w:p>
+    <w:p>
+      <w:pPr>
+        <w:rPr>
+          <w:b/>
+          <w:bCs/>
+        </w:rPr>
+      </w:pPr>
+      <w:r>
+        <w:rPr>
+          <w:b/>
+          <w:bCs/>
         </w:rPr>
         <w:t>Model overview</w:t>
       </w:r>
@@ -412,7 +676,25 @@
         <w:t>population</w:t>
       </w:r>
       <w:r>
-        <w:t xml:space="preserve"> (n = 700,000), reweighted and sized to match age- and sex-specific population projections from the Office for National Statistics [20,21]. The baseline dementia prevalence, age distribution and severity stage mix was set using the Primary Care Dementia Data register. Dementia was defined as diagnosed all-cause dementia, referring to any type of dementia regardless of its cause [22]. We developed a stochastic time-to-event microsimulation model with a dementia stage structure consistent with previous dementia progression models, using longitudinal evidence and mortality projections to inform transition hazards [19, 23, 24, 25]. </w:t>
+        <w:t xml:space="preserve"> (n = 700,000), </w:t>
+      </w:r>
+      <w:r>
+        <w:rPr>
+          <w:highlight w:val="yellow"/>
+        </w:rPr>
+        <w:t>reweighted and sized to match age- and sex-specific</w:t>
+      </w:r>
+      <w:r>
+        <w:t xml:space="preserve"> </w:t>
+      </w:r>
+      <w:r>
+        <w:rPr>
+          <w:highlight w:val="yellow"/>
+        </w:rPr>
+        <w:t>(validated using that)</w:t>
+      </w:r>
+      <w:r>
+        <w:t xml:space="preserve"> population projections from the Office for National Statistics [20,21]. The baseline dementia prevalence, age distribution and severity stage mix was set using the Primary Care Dementia Data register. Dementia was defined as diagnosed all-cause dementia, referring to any type of dementia regardless of its cause [22]. We developed a stochastic time-to-event microsimulation model with a dementia stage structure consistent with previous dementia progression models, using longitudinal evidence and mortality projections to inform transition hazards [19, 23, 24, 25]. </w:t>
       </w:r>
     </w:p>
     <w:p>
@@ -756,7 +1038,11 @@
     </w:p>
     <w:p>
       <w:r>
-        <w:t>The mean time in each dementia stage has been collected from [27]. This provides a constant hazard (exponential assumptions) for the effect that time in a dementia stage has on disease progression. Initial dementia stage was set from a previously published report [26]. We used a parametric proportional hazards age effect to scale the increasing effects that age has on dementia onset. This provides a continuous increase in risk with age rather than discrete banding, as seen in longitudinal studies of dementia incidence [28]. We calculated the relevant β for the per-year log-hazard slope increase of stage transitions [29,30,31]</w:t>
+        <w:t xml:space="preserve">The mean time in each dementia stage has been collected from [27]. This provides a constant hazard (exponential assumptions) for the effect that time in a dementia stage has on disease progression. Initial dementia stage was set from a previously published </w:t>
+      </w:r>
+      <w:r>
+        <w:lastRenderedPageBreak/>
+        <w:t>report [26]. We used a parametric proportional hazards age effect to scale the increasing effects that age has on dementia onset. This provides a continuous increase in risk with age rather than discrete banding, as seen in longitudinal studies of dementia incidence [28]. We calculated the relevant β for the per-year log-hazard slope increase of stage transitions [29,30,31]</w:t>
       </w:r>
       <w:r>
         <w:t xml:space="preserve">. </w:t>
@@ -1242,7 +1528,6 @@
                 <w:b/>
                 <w:bCs/>
               </w:rPr>
-              <w:lastRenderedPageBreak/>
               <w:t>APOE ε4 carrier</w:t>
             </w:r>
           </w:p>
@@ -1320,6 +1605,7 @@
     </w:p>
     <w:p>
       <w:r>
+        <w:lastRenderedPageBreak/>
         <w:t xml:space="preserve">We estimated the economic costs of dementia for direct formal healthcare and social care and informal caregivers. Table </w:t>
       </w:r>
       <w:r>
@@ -2202,7 +2488,6 @@
           <w:b/>
           <w:bCs/>
         </w:rPr>
-        <w:lastRenderedPageBreak/>
         <w:t xml:space="preserve">Table </w:t>
       </w:r>
       <w:r>
@@ -2244,6 +2529,7 @@
           <w:bCs/>
           <w:noProof/>
         </w:rPr>
+        <w:lastRenderedPageBreak/>
         <w:drawing>
           <wp:inline distT="0" distB="0" distL="0" distR="0" wp14:anchorId="2ABEA79F" wp14:editId="46518A24">
             <wp:extent cx="6355594" cy="2020186"/>
@@ -2457,6 +2743,7 @@
           <w:b/>
           <w:bCs/>
         </w:rPr>
+        <w:lastRenderedPageBreak/>
         <w:t>Disease outcomes</w:t>
       </w:r>
     </w:p>
@@ -4230,7 +4517,7 @@
           <w:noProof/>
         </w:rPr>
         <w:drawing>
-          <wp:inline distT="0" distB="0" distL="0" distR="0" wp14:anchorId="687D4031" wp14:editId="459C4992">
+          <wp:inline distT="0" distB="0" distL="0" distR="0" wp14:anchorId="687D4031" wp14:editId="7D338FB9">
             <wp:extent cx="5991225" cy="4285873"/>
             <wp:effectExtent l="0" t="0" r="0" b="635"/>
             <wp:docPr id="1062747639" name="Picture 5"/>

</xml_diff>